<commit_message>
feat: IA enrichment + DB docentes + admin panel + auth + docs dinámicos
</commit_message>
<xml_diff>
--- a/resources/Convocatoria_Docentes.docx
+++ b/resources/Convocatoria_Docentes.docx
@@ -1083,12 +1083,15 @@
               </w:rPr>
             </w:pPr>
             <w:r>
-              <w:rPr>
-                <w:rFonts w:ascii="Verdana" w:hAnsi="Verdana" w:cs="Arial"/>
-                <w:sz w:val="20"/>
-                <w:szCs w:val="20"/>
-              </w:rPr>
               <w:t>___________________________</w:t>
+              <w:br/>
+            </w:r>
+            <w:r>
+              <w:t>{{FIRMA_NOMBRE}}</w:t>
+              <w:br/>
+            </w:r>
+            <w:r>
+              <w:t>{{FIRMA_CARGO}}</w:t>
             </w:r>
           </w:p>
           <w:p>
@@ -1099,14 +1102,6 @@
                 <w:szCs w:val="20"/>
               </w:rPr>
             </w:pPr>
-            <w:r>
-              <w:rPr>
-                <w:rFonts w:ascii="Verdana" w:hAnsi="Verdana" w:cs="Arial"/>
-                <w:sz w:val="20"/>
-                <w:szCs w:val="20"/>
-              </w:rPr>
-              <w:t>Lic. María Basantes Robalino, Mg.</w:t>
-            </w:r>
           </w:p>
           <w:p>
             <w:pPr>
@@ -1116,14 +1111,6 @@
                 <w:szCs w:val="20"/>
               </w:rPr>
             </w:pPr>
-            <w:r>
-              <w:rPr>
-                <w:rFonts w:ascii="Verdana" w:hAnsi="Verdana" w:cs="Arial"/>
-                <w:sz w:val="20"/>
-                <w:szCs w:val="20"/>
-              </w:rPr>
-              <w:t xml:space="preserve">Docente </w:t>
-            </w:r>
           </w:p>
         </w:tc>
         <w:tc>
@@ -1148,228 +1135,16 @@
               </w:rPr>
             </w:pPr>
             <w:r>
-              <w:rPr>
-                <w:rFonts w:ascii="Verdana" w:hAnsi="Verdana" w:cs="Arial"/>
-                <w:sz w:val="20"/>
-                <w:szCs w:val="20"/>
-                <w:lang w:val="pt-PT"/>
-              </w:rPr>
               <w:t>___________________________</w:t>
-            </w:r>
-          </w:p>
-          <w:p>
-            <w:pPr>
-              <w:rPr>
-                <w:rFonts w:ascii="Verdana" w:hAnsi="Verdana" w:cs="Arial"/>
-                <w:sz w:val="20"/>
-                <w:szCs w:val="20"/>
-                <w:lang w:val="pt-PT"/>
-              </w:rPr>
-            </w:pPr>
-            <w:r>
-              <w:rPr>
-                <w:rFonts w:ascii="Verdana" w:hAnsi="Verdana" w:cs="Arial"/>
-                <w:sz w:val="20"/>
-                <w:szCs w:val="20"/>
-                <w:lang w:val="pt-PT"/>
-              </w:rPr>
-              <w:t>Lic. Gabriel Bazurto Alcívar, Mg.</w:t>
-            </w:r>
-          </w:p>
-          <w:p>
-            <w:pPr>
-              <w:rPr>
-                <w:rFonts w:ascii="Verdana" w:hAnsi="Verdana" w:cs="Arial"/>
-                <w:sz w:val="20"/>
-                <w:szCs w:val="20"/>
-                <w:lang w:val="pt-PT"/>
-              </w:rPr>
-            </w:pPr>
-            <w:r>
-              <w:rPr>
-                <w:rFonts w:ascii="Verdana" w:hAnsi="Verdana" w:cs="Arial"/>
-                <w:sz w:val="20"/>
-                <w:szCs w:val="20"/>
-                <w:lang w:val="pt-PT"/>
-              </w:rPr>
-              <w:t>Docente</w:t>
-            </w:r>
-          </w:p>
-        </w:tc>
-      </w:tr>
-      <w:tr>
-        <w:trPr>
-          <w:trHeight w:val="2268"/>
-        </w:trPr>
-        <w:tc>
-          <w:tcPr>
-            <w:tcW w:w="4673" w:type="dxa"/>
-            <w:tcBorders>
-              <w:top w:val="single" w:sz="4" w:space="0" w:color="auto"/>
-              <w:left w:val="single" w:sz="4" w:space="0" w:color="auto"/>
-              <w:bottom w:val="single" w:sz="4" w:space="0" w:color="auto"/>
-              <w:right w:val="single" w:sz="4" w:space="0" w:color="auto"/>
-            </w:tcBorders>
-            <w:vAlign w:val="bottom"/>
-            <w:hideMark/>
-          </w:tcPr>
-          <w:p>
-            <w:pPr>
-              <w:rPr>
-                <w:rFonts w:ascii="Verdana" w:hAnsi="Verdana" w:cs="Arial"/>
-                <w:sz w:val="20"/>
-                <w:szCs w:val="20"/>
-                <w:lang w:val="pt-BR"/>
-              </w:rPr>
-            </w:pPr>
-            <w:r>
-              <w:rPr>
-                <w:rFonts w:ascii="Verdana" w:hAnsi="Verdana" w:cs="Arial"/>
-                <w:sz w:val="20"/>
-                <w:szCs w:val="20"/>
-                <w:lang w:val="pt-BR"/>
-              </w:rPr>
-              <w:t>_____________________________</w:t>
-            </w:r>
-          </w:p>
-          <w:p>
-            <w:pPr>
-              <w:rPr>
-                <w:rFonts w:ascii="Verdana" w:hAnsi="Verdana" w:cs="Arial"/>
-                <w:sz w:val="20"/>
-                <w:szCs w:val="20"/>
-                <w:lang w:val="pt-BR"/>
-              </w:rPr>
-            </w:pPr>
-            <w:r>
-              <w:rPr>
-                <w:rFonts w:ascii="Verdana" w:hAnsi="Verdana" w:cs="Arial"/>
-                <w:sz w:val="20"/>
-                <w:szCs w:val="20"/>
-                <w:lang w:val="pt-BR"/>
-              </w:rPr>
-              <w:t xml:space="preserve">Lic. </w:t>
+              <w:br/>
             </w:r>
             <w:r>
-              <w:rPr>
-                <w:rFonts w:ascii="Verdana" w:hAnsi="Verdana" w:cs="Arial"/>
-                <w:sz w:val="20"/>
-                <w:szCs w:val="20"/>
-                <w:lang w:val="pt-BR"/>
-              </w:rPr>
-              <w:t>Jorge Corral Jiniaux, Mg.</w:t>
+              <w:t>{{FIRMA_NOMBRE}}</w:t>
+              <w:br/>
             </w:r>
-          </w:p>
-          <w:p>
-            <w:pPr>
-              <w:rPr>
-                <w:rFonts w:ascii="Verdana" w:hAnsi="Verdana" w:cs="Arial"/>
-                <w:sz w:val="20"/>
-                <w:szCs w:val="20"/>
-                <w:lang w:val="pt-BR"/>
-              </w:rPr>
-            </w:pPr>
             <w:r>
-              <w:rPr>
-                <w:rFonts w:ascii="Verdana" w:hAnsi="Verdana" w:cs="Arial"/>
-                <w:sz w:val="20"/>
-                <w:szCs w:val="20"/>
-                <w:lang w:val="pt-PT"/>
-              </w:rPr>
-              <w:t>Docente</w:t>
+              <w:t>{{FIRMA_CARGO}}</w:t>
             </w:r>
-          </w:p>
-        </w:tc>
-        <w:tc>
-          <w:tcPr>
-            <w:tcW w:w="4253" w:type="dxa"/>
-            <w:tcBorders>
-              <w:top w:val="single" w:sz="4" w:space="0" w:color="auto"/>
-              <w:left w:val="single" w:sz="4" w:space="0" w:color="auto"/>
-              <w:bottom w:val="single" w:sz="4" w:space="0" w:color="auto"/>
-              <w:right w:val="single" w:sz="4" w:space="0" w:color="auto"/>
-            </w:tcBorders>
-            <w:vAlign w:val="bottom"/>
-            <w:hideMark/>
-          </w:tcPr>
-          <w:p>
-            <w:pPr>
-              <w:rPr>
-                <w:rFonts w:ascii="Verdana" w:hAnsi="Verdana" w:cs="Arial"/>
-                <w:sz w:val="20"/>
-                <w:szCs w:val="20"/>
-              </w:rPr>
-            </w:pPr>
-            <w:r>
-              <w:rPr>
-                <w:rFonts w:ascii="Verdana" w:hAnsi="Verdana" w:cs="Arial"/>
-                <w:sz w:val="20"/>
-                <w:szCs w:val="20"/>
-              </w:rPr>
-              <w:t>_____________________________</w:t>
-            </w:r>
-          </w:p>
-          <w:p>
-            <w:pPr>
-              <w:rPr>
-                <w:rFonts w:ascii="Verdana" w:hAnsi="Verdana" w:cs="Arial"/>
-                <w:sz w:val="20"/>
-                <w:szCs w:val="20"/>
-              </w:rPr>
-            </w:pPr>
-            <w:r>
-              <w:rPr>
-                <w:rFonts w:ascii="Verdana" w:hAnsi="Verdana" w:cs="Arial"/>
-                <w:sz w:val="20"/>
-                <w:szCs w:val="20"/>
-              </w:rPr>
-              <w:t>Lic. Germán Carrera Moreno, Mg.</w:t>
-            </w:r>
-          </w:p>
-          <w:p>
-            <w:pPr>
-              <w:rPr>
-                <w:rFonts w:ascii="Verdana" w:hAnsi="Verdana" w:cs="Arial"/>
-                <w:sz w:val="20"/>
-                <w:szCs w:val="20"/>
-              </w:rPr>
-            </w:pPr>
-            <w:r>
-              <w:rPr>
-                <w:rFonts w:ascii="Verdana" w:hAnsi="Verdana" w:cs="Arial"/>
-                <w:sz w:val="20"/>
-                <w:szCs w:val="20"/>
-                <w:lang w:val="pt-PT"/>
-              </w:rPr>
-              <w:t xml:space="preserve">Director </w:t>
-            </w:r>
-          </w:p>
-        </w:tc>
-      </w:tr>
-      <w:tr>
-        <w:trPr>
-          <w:trHeight w:val="2268"/>
-        </w:trPr>
-        <w:tc>
-          <w:tcPr>
-            <w:tcW w:w="4673" w:type="dxa"/>
-            <w:tcBorders>
-              <w:top w:val="single" w:sz="4" w:space="0" w:color="auto"/>
-              <w:left w:val="single" w:sz="4" w:space="0" w:color="auto"/>
-              <w:bottom w:val="single" w:sz="4" w:space="0" w:color="auto"/>
-              <w:right w:val="single" w:sz="4" w:space="0" w:color="auto"/>
-            </w:tcBorders>
-            <w:vAlign w:val="bottom"/>
-          </w:tcPr>
-          <w:p>
-            <w:pPr>
-              <w:rPr>
-                <w:rFonts w:ascii="Verdana" w:hAnsi="Verdana" w:cs="Arial"/>
-                <w:sz w:val="20"/>
-                <w:szCs w:val="20"/>
-                <w:lang w:val="pt-PT"/>
-              </w:rPr>
-            </w:pPr>
           </w:p>
           <w:p>
             <w:pPr>
@@ -1390,409 +1165,6 @@
                 <w:lang w:val="pt-PT"/>
               </w:rPr>
             </w:pPr>
-            <w:r>
-              <w:rPr>
-                <w:rFonts w:ascii="Verdana" w:hAnsi="Verdana" w:cs="Arial"/>
-                <w:sz w:val="20"/>
-                <w:szCs w:val="20"/>
-                <w:lang w:val="pt-PT"/>
-              </w:rPr>
-              <w:t>___________________________</w:t>
-            </w:r>
-          </w:p>
-          <w:p>
-            <w:pPr>
-              <w:rPr>
-                <w:rFonts w:ascii="Verdana" w:hAnsi="Verdana" w:cs="Arial"/>
-                <w:sz w:val="20"/>
-                <w:szCs w:val="20"/>
-                <w:lang w:val="pt-PT"/>
-              </w:rPr>
-            </w:pPr>
-            <w:r>
-              <w:rPr>
-                <w:rFonts w:ascii="Verdana" w:hAnsi="Verdana" w:cs="Arial"/>
-                <w:sz w:val="20"/>
-                <w:szCs w:val="20"/>
-                <w:lang w:val="pt-PT"/>
-              </w:rPr>
-              <w:t>Lic. Verónica Chávez Zambrano, Mg.</w:t>
-            </w:r>
-          </w:p>
-          <w:p>
-            <w:pPr>
-              <w:rPr>
-                <w:rFonts w:ascii="Verdana" w:hAnsi="Verdana" w:cs="Arial"/>
-                <w:sz w:val="20"/>
-                <w:szCs w:val="20"/>
-                <w:lang w:val="pt-PT"/>
-              </w:rPr>
-            </w:pPr>
-            <w:r>
-              <w:rPr>
-                <w:rFonts w:ascii="Verdana" w:hAnsi="Verdana" w:cs="Arial"/>
-                <w:sz w:val="20"/>
-                <w:szCs w:val="20"/>
-                <w:lang w:val="pt-PT"/>
-              </w:rPr>
-              <w:t>Docente</w:t>
-            </w:r>
-          </w:p>
-        </w:tc>
-        <w:tc>
-          <w:tcPr>
-            <w:tcW w:w="4253" w:type="dxa"/>
-            <w:tcBorders>
-              <w:top w:val="single" w:sz="4" w:space="0" w:color="auto"/>
-              <w:left w:val="single" w:sz="4" w:space="0" w:color="auto"/>
-              <w:bottom w:val="single" w:sz="4" w:space="0" w:color="auto"/>
-              <w:right w:val="single" w:sz="4" w:space="0" w:color="auto"/>
-            </w:tcBorders>
-            <w:vAlign w:val="bottom"/>
-            <w:hideMark/>
-          </w:tcPr>
-          <w:p>
-            <w:pPr>
-              <w:rPr>
-                <w:rFonts w:ascii="Verdana" w:hAnsi="Verdana" w:cs="Arial"/>
-                <w:sz w:val="20"/>
-                <w:szCs w:val="20"/>
-              </w:rPr>
-            </w:pPr>
-            <w:r>
-              <w:rPr>
-                <w:rFonts w:ascii="Verdana" w:hAnsi="Verdana" w:cs="Arial"/>
-                <w:sz w:val="20"/>
-                <w:szCs w:val="20"/>
-              </w:rPr>
-              <w:t>_____________________________</w:t>
-            </w:r>
-          </w:p>
-          <w:p>
-            <w:pPr>
-              <w:rPr>
-                <w:rFonts w:ascii="Verdana" w:hAnsi="Verdana" w:cs="Arial"/>
-                <w:sz w:val="20"/>
-                <w:szCs w:val="20"/>
-              </w:rPr>
-            </w:pPr>
-            <w:r>
-              <w:rPr>
-                <w:rFonts w:ascii="Verdana" w:hAnsi="Verdana" w:cs="Arial"/>
-                <w:sz w:val="20"/>
-                <w:szCs w:val="20"/>
-              </w:rPr>
-              <w:t>Lic. Gonzalo Farfán Corrales, Mg.</w:t>
-            </w:r>
-          </w:p>
-          <w:p>
-            <w:pPr>
-              <w:rPr>
-                <w:rFonts w:ascii="Verdana" w:hAnsi="Verdana" w:cs="Arial"/>
-                <w:sz w:val="20"/>
-                <w:szCs w:val="20"/>
-              </w:rPr>
-            </w:pPr>
-            <w:r>
-              <w:rPr>
-                <w:rFonts w:ascii="Verdana" w:hAnsi="Verdana" w:cs="Arial"/>
-                <w:sz w:val="20"/>
-                <w:szCs w:val="20"/>
-                <w:lang w:val="pt-PT"/>
-              </w:rPr>
-              <w:t>Docente</w:t>
-            </w:r>
-          </w:p>
-        </w:tc>
-      </w:tr>
-      <w:tr>
-        <w:trPr>
-          <w:trHeight w:val="2268"/>
-        </w:trPr>
-        <w:tc>
-          <w:tcPr>
-            <w:tcW w:w="4673" w:type="dxa"/>
-            <w:tcBorders>
-              <w:top w:val="single" w:sz="4" w:space="0" w:color="auto"/>
-              <w:left w:val="single" w:sz="4" w:space="0" w:color="auto"/>
-              <w:bottom w:val="single" w:sz="4" w:space="0" w:color="auto"/>
-              <w:right w:val="single" w:sz="4" w:space="0" w:color="auto"/>
-            </w:tcBorders>
-            <w:vAlign w:val="bottom"/>
-          </w:tcPr>
-          <w:p>
-            <w:pPr>
-              <w:rPr>
-                <w:rFonts w:ascii="Verdana" w:hAnsi="Verdana" w:cs="Arial"/>
-                <w:sz w:val="20"/>
-                <w:szCs w:val="20"/>
-                <w:lang w:val="pt-PT"/>
-              </w:rPr>
-            </w:pPr>
-          </w:p>
-          <w:p>
-            <w:pPr>
-              <w:rPr>
-                <w:rFonts w:ascii="Verdana" w:hAnsi="Verdana" w:cs="Arial"/>
-                <w:sz w:val="20"/>
-                <w:szCs w:val="20"/>
-                <w:lang w:val="pt-PT"/>
-              </w:rPr>
-            </w:pPr>
-            <w:r>
-              <w:rPr>
-                <w:rFonts w:ascii="Verdana" w:hAnsi="Verdana" w:cs="Arial"/>
-                <w:sz w:val="20"/>
-                <w:szCs w:val="20"/>
-                <w:lang w:val="pt-PT"/>
-              </w:rPr>
-              <w:t>_____________________________</w:t>
-            </w:r>
-          </w:p>
-          <w:p>
-            <w:pPr>
-              <w:rPr>
-                <w:rFonts w:ascii="Verdana" w:hAnsi="Verdana" w:cs="Arial"/>
-                <w:sz w:val="20"/>
-                <w:szCs w:val="20"/>
-                <w:lang w:val="pt-PT"/>
-              </w:rPr>
-            </w:pPr>
-            <w:r>
-              <w:rPr>
-                <w:rFonts w:ascii="Verdana" w:hAnsi="Verdana" w:cs="Arial"/>
-                <w:sz w:val="20"/>
-                <w:szCs w:val="20"/>
-                <w:lang w:val="pt-PT"/>
-              </w:rPr>
-              <w:t>Lic. Laura Mena Sánchez, Mg.</w:t>
-            </w:r>
-          </w:p>
-          <w:p>
-            <w:pPr>
-              <w:rPr>
-                <w:rFonts w:ascii="Verdana" w:hAnsi="Verdana" w:cs="Arial"/>
-                <w:sz w:val="20"/>
-                <w:szCs w:val="20"/>
-                <w:lang w:val="pt-PT"/>
-              </w:rPr>
-            </w:pPr>
-            <w:r>
-              <w:rPr>
-                <w:rFonts w:ascii="Verdana" w:hAnsi="Verdana" w:cs="Arial"/>
-                <w:sz w:val="20"/>
-                <w:szCs w:val="20"/>
-                <w:lang w:val="pt-PT"/>
-              </w:rPr>
-              <w:t xml:space="preserve">Docente </w:t>
-            </w:r>
-          </w:p>
-        </w:tc>
-        <w:tc>
-          <w:tcPr>
-            <w:tcW w:w="4253" w:type="dxa"/>
-            <w:tcBorders>
-              <w:top w:val="single" w:sz="4" w:space="0" w:color="auto"/>
-              <w:left w:val="single" w:sz="4" w:space="0" w:color="auto"/>
-              <w:bottom w:val="single" w:sz="4" w:space="0" w:color="auto"/>
-              <w:right w:val="single" w:sz="4" w:space="0" w:color="auto"/>
-            </w:tcBorders>
-            <w:vAlign w:val="bottom"/>
-            <w:hideMark/>
-          </w:tcPr>
-          <w:p>
-            <w:pPr>
-              <w:rPr>
-                <w:rFonts w:ascii="Verdana" w:hAnsi="Verdana" w:cs="Arial"/>
-                <w:sz w:val="20"/>
-                <w:szCs w:val="20"/>
-              </w:rPr>
-            </w:pPr>
-            <w:r>
-              <w:rPr>
-                <w:rFonts w:ascii="Verdana" w:hAnsi="Verdana" w:cs="Arial"/>
-                <w:sz w:val="20"/>
-                <w:szCs w:val="20"/>
-              </w:rPr>
-              <w:t>_____________________________</w:t>
-            </w:r>
-          </w:p>
-          <w:p>
-            <w:pPr>
-              <w:rPr>
-                <w:rFonts w:ascii="Verdana" w:hAnsi="Verdana" w:cs="Arial"/>
-                <w:sz w:val="20"/>
-                <w:szCs w:val="20"/>
-              </w:rPr>
-            </w:pPr>
-            <w:r>
-              <w:rPr>
-                <w:rFonts w:ascii="Verdana" w:hAnsi="Verdana" w:cs="Arial"/>
-                <w:sz w:val="20"/>
-                <w:szCs w:val="20"/>
-              </w:rPr>
-              <w:t>Dr. Arturo Rodríguez Zambrano, PhD.</w:t>
-            </w:r>
-          </w:p>
-          <w:p>
-            <w:pPr>
-              <w:rPr>
-                <w:rFonts w:ascii="Verdana" w:hAnsi="Verdana" w:cs="Arial"/>
-                <w:sz w:val="20"/>
-                <w:szCs w:val="20"/>
-                <w:lang w:val="pt-PT"/>
-              </w:rPr>
-            </w:pPr>
-            <w:r>
-              <w:rPr>
-                <w:rFonts w:ascii="Verdana" w:hAnsi="Verdana" w:cs="Arial"/>
-                <w:sz w:val="20"/>
-                <w:szCs w:val="20"/>
-              </w:rPr>
-              <w:t xml:space="preserve">Docente   </w:t>
-            </w:r>
-          </w:p>
-        </w:tc>
-      </w:tr>
-      <w:tr>
-        <w:trPr>
-          <w:trHeight w:val="2268"/>
-        </w:trPr>
-        <w:tc>
-          <w:tcPr>
-            <w:tcW w:w="4673" w:type="dxa"/>
-            <w:tcBorders>
-              <w:top w:val="single" w:sz="4" w:space="0" w:color="auto"/>
-              <w:left w:val="single" w:sz="4" w:space="0" w:color="auto"/>
-              <w:bottom w:val="single" w:sz="4" w:space="0" w:color="auto"/>
-              <w:right w:val="single" w:sz="4" w:space="0" w:color="auto"/>
-            </w:tcBorders>
-            <w:vAlign w:val="bottom"/>
-            <w:hideMark/>
-          </w:tcPr>
-          <w:p>
-            <w:pPr>
-              <w:rPr>
-                <w:rFonts w:ascii="Verdana" w:hAnsi="Verdana" w:cs="Arial"/>
-                <w:sz w:val="20"/>
-                <w:szCs w:val="20"/>
-              </w:rPr>
-            </w:pPr>
-            <w:r>
-              <w:rPr>
-                <w:rFonts w:ascii="Verdana" w:hAnsi="Verdana" w:cs="Arial"/>
-                <w:sz w:val="20"/>
-                <w:szCs w:val="20"/>
-              </w:rPr>
-              <w:t>_____________________________</w:t>
-            </w:r>
-          </w:p>
-          <w:p>
-            <w:pPr>
-              <w:rPr>
-                <w:rFonts w:ascii="Verdana" w:hAnsi="Verdana" w:cs="Arial"/>
-                <w:sz w:val="20"/>
-                <w:szCs w:val="20"/>
-              </w:rPr>
-            </w:pPr>
-            <w:r>
-              <w:rPr>
-                <w:rFonts w:ascii="Verdana" w:hAnsi="Verdana" w:cs="Arial"/>
-                <w:sz w:val="20"/>
-                <w:szCs w:val="20"/>
-              </w:rPr>
-              <w:t>Dr. Jhonny Villafuerte Holguín, PhD.</w:t>
-            </w:r>
-          </w:p>
-          <w:p>
-            <w:pPr>
-              <w:rPr>
-                <w:rFonts w:ascii="Verdana" w:hAnsi="Verdana" w:cs="Arial"/>
-                <w:sz w:val="20"/>
-                <w:szCs w:val="20"/>
-                <w:lang w:val="pt-PT"/>
-              </w:rPr>
-            </w:pPr>
-            <w:r>
-              <w:rPr>
-                <w:rFonts w:ascii="Verdana" w:hAnsi="Verdana" w:cs="Arial"/>
-                <w:sz w:val="20"/>
-                <w:szCs w:val="20"/>
-              </w:rPr>
-              <w:t xml:space="preserve">Docente   </w:t>
-            </w:r>
-          </w:p>
-        </w:tc>
-        <w:tc>
-          <w:tcPr>
-            <w:tcW w:w="4253" w:type="dxa"/>
-            <w:tcBorders>
-              <w:top w:val="single" w:sz="4" w:space="0" w:color="auto"/>
-              <w:left w:val="single" w:sz="4" w:space="0" w:color="auto"/>
-              <w:bottom w:val="single" w:sz="4" w:space="0" w:color="auto"/>
-              <w:right w:val="single" w:sz="4" w:space="0" w:color="auto"/>
-            </w:tcBorders>
-            <w:vAlign w:val="bottom"/>
-            <w:hideMark/>
-          </w:tcPr>
-          <w:p>
-            <w:pPr>
-              <w:jc w:val="both"/>
-              <w:rPr>
-                <w:rFonts w:ascii="Verdana" w:hAnsi="Verdana" w:cs="Arial"/>
-                <w:sz w:val="20"/>
-                <w:szCs w:val="20"/>
-                <w:lang w:val="pt-PT"/>
-              </w:rPr>
-            </w:pPr>
-            <w:r>
-              <w:rPr>
-                <w:rFonts w:ascii="Verdana" w:hAnsi="Verdana" w:cs="Arial"/>
-                <w:sz w:val="20"/>
-                <w:szCs w:val="20"/>
-                <w:lang w:val="pt-PT"/>
-              </w:rPr>
-              <w:t>_____________________________</w:t>
-            </w:r>
-          </w:p>
-          <w:p>
-            <w:pPr>
-              <w:jc w:val="both"/>
-              <w:rPr>
-                <w:rFonts w:ascii="Verdana" w:hAnsi="Verdana" w:cs="Arial"/>
-                <w:sz w:val="20"/>
-                <w:szCs w:val="20"/>
-                <w:lang w:val="pt-PT"/>
-              </w:rPr>
-            </w:pPr>
-            <w:r>
-              <w:rPr>
-                <w:rFonts w:ascii="Verdana" w:hAnsi="Verdana" w:cs="Arial"/>
-                <w:sz w:val="20"/>
-                <w:szCs w:val="20"/>
-                <w:lang w:val="pt-PT"/>
-              </w:rPr>
-              <w:t>Lic. Cintya Zambrano Zambrano, Mg.</w:t>
-            </w:r>
-          </w:p>
-          <w:p>
-            <w:pPr>
-              <w:jc w:val="both"/>
-              <w:rPr>
-                <w:rFonts w:ascii="Verdana" w:hAnsi="Verdana" w:cs="Arial"/>
-                <w:sz w:val="20"/>
-                <w:szCs w:val="20"/>
-              </w:rPr>
-            </w:pPr>
-            <w:r>
-              <w:rPr>
-                <w:rFonts w:ascii="Verdana" w:hAnsi="Verdana" w:cs="Arial"/>
-                <w:sz w:val="20"/>
-                <w:szCs w:val="20"/>
-                <w:lang w:val="pt-PT"/>
-              </w:rPr>
-              <w:t>Docente</w:t>
-            </w:r>
           </w:p>
         </w:tc>
       </w:tr>
@@ -2300,13 +1672,7 @@
               </w:rPr>
             </w:pPr>
             <w:r>
-              <w:rPr>
-                <w:rFonts w:ascii="Verdana" w:hAnsi="Verdana" w:cs="Calibri"/>
-                <w:color w:val="000000" w:themeColor="text1"/>
-                <w:sz w:val="20"/>
-                <w:szCs w:val="20"/>
-              </w:rPr>
-              <w:t>1</w:t>
+              <w:t>{{NUM}}</w:t>
             </w:r>
           </w:p>
         </w:tc>
@@ -2332,13 +1698,7 @@
               </w:rPr>
             </w:pPr>
             <w:r>
-              <w:rPr>
-                <w:rFonts w:ascii="Verdana" w:hAnsi="Verdana" w:cs="Calibri"/>
-                <w:color w:val="000000"/>
-                <w:sz w:val="20"/>
-                <w:szCs w:val="20"/>
-              </w:rPr>
-              <w:t>Docente</w:t>
+              <w:t>{{CARGO_DOCENTE}}</w:t>
             </w:r>
           </w:p>
         </w:tc>
@@ -2365,13 +1725,7 @@
               </w:rPr>
             </w:pPr>
             <w:r>
-              <w:rPr>
-                <w:rFonts w:ascii="Verdana" w:hAnsi="Verdana" w:cs="Calibri"/>
-                <w:color w:val="000000"/>
-                <w:sz w:val="20"/>
-                <w:szCs w:val="20"/>
-              </w:rPr>
-              <w:t xml:space="preserve">Lic. María Basantes Robalino, Mg.  </w:t>
+              <w:t>{{NOMBRE_DOCENTE}}</w:t>
             </w:r>
           </w:p>
         </w:tc>
@@ -2394,1126 +1748,6 @@
                 <w:sz w:val="20"/>
                 <w:szCs w:val="20"/>
                 <w:lang w:val="es-EC"/>
-              </w:rPr>
-            </w:pPr>
-          </w:p>
-        </w:tc>
-      </w:tr>
-      <w:tr>
-        <w:trPr>
-          <w:trHeight w:val="680"/>
-        </w:trPr>
-        <w:tc>
-          <w:tcPr>
-            <w:tcW w:w="308" w:type="pct"/>
-            <w:tcBorders>
-              <w:top w:val="single" w:sz="4" w:space="0" w:color="auto"/>
-              <w:left w:val="single" w:sz="4" w:space="0" w:color="auto"/>
-              <w:bottom w:val="single" w:sz="4" w:space="0" w:color="auto"/>
-              <w:right w:val="single" w:sz="4" w:space="0" w:color="auto"/>
-            </w:tcBorders>
-            <w:vAlign w:val="center"/>
-            <w:hideMark/>
-          </w:tcPr>
-          <w:p>
-            <w:pPr>
-              <w:jc w:val="center"/>
-              <w:rPr>
-                <w:rFonts w:ascii="Verdana" w:hAnsi="Verdana" w:cs="Calibri"/>
-                <w:color w:val="000000" w:themeColor="text1"/>
-                <w:sz w:val="20"/>
-                <w:szCs w:val="20"/>
-              </w:rPr>
-            </w:pPr>
-            <w:r>
-              <w:rPr>
-                <w:rFonts w:ascii="Verdana" w:hAnsi="Verdana" w:cs="Calibri"/>
-                <w:color w:val="000000" w:themeColor="text1"/>
-                <w:sz w:val="20"/>
-                <w:szCs w:val="20"/>
-              </w:rPr>
-              <w:t>2</w:t>
-            </w:r>
-          </w:p>
-        </w:tc>
-        <w:tc>
-          <w:tcPr>
-            <w:tcW w:w="1231" w:type="pct"/>
-            <w:tcBorders>
-              <w:top w:val="single" w:sz="4" w:space="0" w:color="auto"/>
-              <w:left w:val="nil"/>
-              <w:bottom w:val="single" w:sz="4" w:space="0" w:color="auto"/>
-              <w:right w:val="single" w:sz="4" w:space="0" w:color="auto"/>
-            </w:tcBorders>
-            <w:vAlign w:val="center"/>
-            <w:hideMark/>
-          </w:tcPr>
-          <w:p>
-            <w:pPr>
-              <w:rPr>
-                <w:rFonts w:ascii="Verdana" w:hAnsi="Verdana" w:cs="Calibri"/>
-                <w:color w:val="000000"/>
-                <w:sz w:val="20"/>
-                <w:szCs w:val="20"/>
-              </w:rPr>
-            </w:pPr>
-            <w:r>
-              <w:rPr>
-                <w:rFonts w:ascii="Verdana" w:hAnsi="Verdana" w:cs="Calibri"/>
-                <w:color w:val="000000"/>
-                <w:sz w:val="20"/>
-                <w:szCs w:val="20"/>
-              </w:rPr>
-              <w:t>Docente</w:t>
-            </w:r>
-          </w:p>
-        </w:tc>
-        <w:tc>
-          <w:tcPr>
-            <w:tcW w:w="2231" w:type="pct"/>
-            <w:tcBorders>
-              <w:top w:val="single" w:sz="4" w:space="0" w:color="auto"/>
-              <w:left w:val="single" w:sz="4" w:space="0" w:color="auto"/>
-              <w:bottom w:val="single" w:sz="4" w:space="0" w:color="auto"/>
-              <w:right w:val="nil"/>
-            </w:tcBorders>
-            <w:vAlign w:val="center"/>
-            <w:hideMark/>
-          </w:tcPr>
-          <w:p>
-            <w:pPr>
-              <w:jc w:val="both"/>
-              <w:rPr>
-                <w:rFonts w:ascii="Verdana" w:hAnsi="Verdana" w:cs="Calibri"/>
-                <w:color w:val="000000"/>
-                <w:sz w:val="20"/>
-                <w:szCs w:val="20"/>
-              </w:rPr>
-            </w:pPr>
-            <w:r>
-              <w:rPr>
-                <w:rFonts w:ascii="Verdana" w:hAnsi="Verdana" w:cs="Calibri"/>
-                <w:color w:val="000000"/>
-                <w:sz w:val="20"/>
-                <w:szCs w:val="20"/>
-              </w:rPr>
-              <w:t>Lic. Gabriel Bazurto Alcívar, Mg.</w:t>
-            </w:r>
-          </w:p>
-        </w:tc>
-        <w:tc>
-          <w:tcPr>
-            <w:tcW w:w="1230" w:type="pct"/>
-            <w:tcBorders>
-              <w:top w:val="single" w:sz="4" w:space="0" w:color="auto"/>
-              <w:left w:val="single" w:sz="4" w:space="0" w:color="auto"/>
-              <w:bottom w:val="single" w:sz="4" w:space="0" w:color="auto"/>
-              <w:right w:val="single" w:sz="4" w:space="0" w:color="auto"/>
-            </w:tcBorders>
-            <w:vAlign w:val="center"/>
-          </w:tcPr>
-          <w:p>
-            <w:pPr>
-              <w:rPr>
-                <w:rFonts w:ascii="Verdana" w:hAnsi="Verdana" w:cs="Calibri"/>
-                <w:color w:val="000000" w:themeColor="text1"/>
-                <w:sz w:val="20"/>
-                <w:szCs w:val="20"/>
-                <w:lang w:val="pt-PT"/>
-              </w:rPr>
-            </w:pPr>
-          </w:p>
-        </w:tc>
-      </w:tr>
-      <w:tr>
-        <w:trPr>
-          <w:trHeight w:val="680"/>
-        </w:trPr>
-        <w:tc>
-          <w:tcPr>
-            <w:tcW w:w="308" w:type="pct"/>
-            <w:tcBorders>
-              <w:top w:val="single" w:sz="4" w:space="0" w:color="auto"/>
-              <w:left w:val="single" w:sz="4" w:space="0" w:color="auto"/>
-              <w:bottom w:val="single" w:sz="4" w:space="0" w:color="auto"/>
-              <w:right w:val="single" w:sz="4" w:space="0" w:color="auto"/>
-            </w:tcBorders>
-            <w:vAlign w:val="center"/>
-            <w:hideMark/>
-          </w:tcPr>
-          <w:p>
-            <w:pPr>
-              <w:jc w:val="center"/>
-              <w:rPr>
-                <w:rFonts w:ascii="Verdana" w:hAnsi="Verdana" w:cs="Calibri"/>
-                <w:color w:val="000000" w:themeColor="text1"/>
-                <w:sz w:val="20"/>
-                <w:szCs w:val="20"/>
-              </w:rPr>
-            </w:pPr>
-            <w:r>
-              <w:rPr>
-                <w:rFonts w:ascii="Verdana" w:hAnsi="Verdana" w:cs="Calibri"/>
-                <w:color w:val="000000" w:themeColor="text1"/>
-                <w:sz w:val="20"/>
-                <w:szCs w:val="20"/>
-              </w:rPr>
-              <w:t>3</w:t>
-            </w:r>
-          </w:p>
-        </w:tc>
-        <w:tc>
-          <w:tcPr>
-            <w:tcW w:w="1231" w:type="pct"/>
-            <w:tcBorders>
-              <w:top w:val="single" w:sz="4" w:space="0" w:color="auto"/>
-              <w:left w:val="nil"/>
-              <w:bottom w:val="single" w:sz="4" w:space="0" w:color="auto"/>
-              <w:right w:val="single" w:sz="4" w:space="0" w:color="auto"/>
-            </w:tcBorders>
-            <w:vAlign w:val="center"/>
-          </w:tcPr>
-          <w:p>
-            <w:pPr>
-              <w:rPr>
-                <w:rFonts w:ascii="Verdana" w:hAnsi="Verdana" w:cs="Calibri"/>
-                <w:color w:val="000000"/>
-                <w:sz w:val="20"/>
-                <w:szCs w:val="20"/>
-              </w:rPr>
-            </w:pPr>
-            <w:r>
-              <w:rPr>
-                <w:rFonts w:ascii="Verdana" w:hAnsi="Verdana" w:cs="Calibri"/>
-                <w:color w:val="000000"/>
-                <w:sz w:val="20"/>
-                <w:szCs w:val="20"/>
-              </w:rPr>
-              <w:t>Director de carrera</w:t>
-            </w:r>
-          </w:p>
-        </w:tc>
-        <w:tc>
-          <w:tcPr>
-            <w:tcW w:w="2231" w:type="pct"/>
-            <w:tcBorders>
-              <w:top w:val="single" w:sz="4" w:space="0" w:color="auto"/>
-              <w:left w:val="single" w:sz="4" w:space="0" w:color="auto"/>
-              <w:bottom w:val="single" w:sz="4" w:space="0" w:color="auto"/>
-              <w:right w:val="nil"/>
-            </w:tcBorders>
-            <w:vAlign w:val="center"/>
-          </w:tcPr>
-          <w:p>
-            <w:pPr>
-              <w:jc w:val="both"/>
-              <w:rPr>
-                <w:rFonts w:ascii="Verdana" w:hAnsi="Verdana" w:cs="Calibri"/>
-                <w:color w:val="000000"/>
-                <w:sz w:val="20"/>
-                <w:szCs w:val="20"/>
-              </w:rPr>
-            </w:pPr>
-            <w:r>
-              <w:rPr>
-                <w:rFonts w:ascii="Verdana" w:hAnsi="Verdana" w:cs="Calibri"/>
-                <w:color w:val="000000"/>
-                <w:sz w:val="20"/>
-                <w:szCs w:val="20"/>
-              </w:rPr>
-              <w:t>Lic. Germán Carrera Moreno, Mg.</w:t>
-            </w:r>
-          </w:p>
-        </w:tc>
-        <w:tc>
-          <w:tcPr>
-            <w:tcW w:w="1230" w:type="pct"/>
-            <w:tcBorders>
-              <w:top w:val="single" w:sz="4" w:space="0" w:color="auto"/>
-              <w:left w:val="single" w:sz="4" w:space="0" w:color="auto"/>
-              <w:bottom w:val="single" w:sz="4" w:space="0" w:color="auto"/>
-              <w:right w:val="single" w:sz="4" w:space="0" w:color="auto"/>
-            </w:tcBorders>
-            <w:vAlign w:val="center"/>
-          </w:tcPr>
-          <w:p>
-            <w:pPr>
-              <w:rPr>
-                <w:rFonts w:ascii="Verdana" w:hAnsi="Verdana" w:cs="Calibri"/>
-                <w:color w:val="000000" w:themeColor="text1"/>
-                <w:sz w:val="20"/>
-                <w:szCs w:val="20"/>
-                <w:lang w:val="es-EC"/>
-              </w:rPr>
-            </w:pPr>
-          </w:p>
-        </w:tc>
-      </w:tr>
-      <w:tr>
-        <w:trPr>
-          <w:trHeight w:val="680"/>
-        </w:trPr>
-        <w:tc>
-          <w:tcPr>
-            <w:tcW w:w="308" w:type="pct"/>
-            <w:tcBorders>
-              <w:top w:val="single" w:sz="4" w:space="0" w:color="auto"/>
-              <w:left w:val="single" w:sz="4" w:space="0" w:color="auto"/>
-              <w:bottom w:val="single" w:sz="4" w:space="0" w:color="auto"/>
-              <w:right w:val="single" w:sz="4" w:space="0" w:color="auto"/>
-            </w:tcBorders>
-            <w:vAlign w:val="center"/>
-            <w:hideMark/>
-          </w:tcPr>
-          <w:p>
-            <w:pPr>
-              <w:jc w:val="center"/>
-              <w:rPr>
-                <w:rFonts w:ascii="Verdana" w:hAnsi="Verdana" w:cs="Calibri"/>
-                <w:color w:val="000000" w:themeColor="text1"/>
-                <w:sz w:val="20"/>
-                <w:szCs w:val="20"/>
-              </w:rPr>
-            </w:pPr>
-            <w:r>
-              <w:rPr>
-                <w:rFonts w:ascii="Verdana" w:hAnsi="Verdana" w:cs="Calibri"/>
-                <w:color w:val="000000" w:themeColor="text1"/>
-                <w:sz w:val="20"/>
-                <w:szCs w:val="20"/>
-              </w:rPr>
-              <w:t>4</w:t>
-            </w:r>
-          </w:p>
-        </w:tc>
-        <w:tc>
-          <w:tcPr>
-            <w:tcW w:w="1231" w:type="pct"/>
-            <w:tcBorders>
-              <w:top w:val="single" w:sz="4" w:space="0" w:color="auto"/>
-              <w:left w:val="nil"/>
-              <w:bottom w:val="single" w:sz="4" w:space="0" w:color="auto"/>
-              <w:right w:val="single" w:sz="4" w:space="0" w:color="auto"/>
-            </w:tcBorders>
-            <w:vAlign w:val="center"/>
-          </w:tcPr>
-          <w:p>
-            <w:pPr>
-              <w:rPr>
-                <w:rFonts w:ascii="Verdana" w:hAnsi="Verdana" w:cs="Calibri"/>
-                <w:color w:val="000000"/>
-                <w:sz w:val="20"/>
-                <w:szCs w:val="20"/>
-              </w:rPr>
-            </w:pPr>
-            <w:r>
-              <w:rPr>
-                <w:rFonts w:ascii="Verdana" w:hAnsi="Verdana" w:cs="Calibri"/>
-                <w:color w:val="000000"/>
-                <w:sz w:val="20"/>
-                <w:szCs w:val="20"/>
-              </w:rPr>
-              <w:t>Docente</w:t>
-            </w:r>
-          </w:p>
-        </w:tc>
-        <w:tc>
-          <w:tcPr>
-            <w:tcW w:w="2231" w:type="pct"/>
-            <w:tcBorders>
-              <w:top w:val="single" w:sz="4" w:space="0" w:color="auto"/>
-              <w:left w:val="single" w:sz="4" w:space="0" w:color="auto"/>
-              <w:bottom w:val="single" w:sz="4" w:space="0" w:color="auto"/>
-              <w:right w:val="nil"/>
-            </w:tcBorders>
-            <w:vAlign w:val="center"/>
-          </w:tcPr>
-          <w:p>
-            <w:pPr>
-              <w:jc w:val="both"/>
-              <w:rPr>
-                <w:rFonts w:ascii="Verdana" w:hAnsi="Verdana" w:cs="Calibri"/>
-                <w:color w:val="000000"/>
-                <w:sz w:val="20"/>
-                <w:szCs w:val="20"/>
-                <w:lang w:val="pt-BR"/>
-              </w:rPr>
-            </w:pPr>
-            <w:r>
-              <w:rPr>
-                <w:rFonts w:ascii="Verdana" w:hAnsi="Verdana" w:cs="Calibri"/>
-                <w:color w:val="000000"/>
-                <w:sz w:val="20"/>
-                <w:szCs w:val="20"/>
-                <w:lang w:val="pt-PT"/>
-              </w:rPr>
-              <w:t>Lic. Jorge Corral Joniaux, Mg.</w:t>
-            </w:r>
-          </w:p>
-        </w:tc>
-        <w:tc>
-          <w:tcPr>
-            <w:tcW w:w="1230" w:type="pct"/>
-            <w:tcBorders>
-              <w:top w:val="single" w:sz="4" w:space="0" w:color="auto"/>
-              <w:left w:val="single" w:sz="4" w:space="0" w:color="auto"/>
-              <w:bottom w:val="single" w:sz="4" w:space="0" w:color="auto"/>
-              <w:right w:val="single" w:sz="4" w:space="0" w:color="auto"/>
-            </w:tcBorders>
-            <w:vAlign w:val="center"/>
-          </w:tcPr>
-          <w:p>
-            <w:pPr>
-              <w:rPr>
-                <w:rFonts w:ascii="Verdana" w:hAnsi="Verdana" w:cs="Calibri"/>
-                <w:color w:val="000000" w:themeColor="text1"/>
-                <w:sz w:val="20"/>
-                <w:szCs w:val="20"/>
-                <w:lang w:val="pt-BR"/>
-              </w:rPr>
-            </w:pPr>
-          </w:p>
-        </w:tc>
-      </w:tr>
-      <w:tr>
-        <w:trPr>
-          <w:trHeight w:val="680"/>
-        </w:trPr>
-        <w:tc>
-          <w:tcPr>
-            <w:tcW w:w="308" w:type="pct"/>
-            <w:tcBorders>
-              <w:top w:val="single" w:sz="4" w:space="0" w:color="auto"/>
-              <w:left w:val="single" w:sz="4" w:space="0" w:color="auto"/>
-              <w:bottom w:val="single" w:sz="4" w:space="0" w:color="auto"/>
-              <w:right w:val="single" w:sz="4" w:space="0" w:color="auto"/>
-            </w:tcBorders>
-            <w:vAlign w:val="center"/>
-            <w:hideMark/>
-          </w:tcPr>
-          <w:p>
-            <w:pPr>
-              <w:jc w:val="center"/>
-              <w:rPr>
-                <w:rFonts w:ascii="Verdana" w:hAnsi="Verdana" w:cs="Calibri"/>
-                <w:color w:val="000000" w:themeColor="text1"/>
-                <w:sz w:val="20"/>
-                <w:szCs w:val="20"/>
-              </w:rPr>
-            </w:pPr>
-            <w:r>
-              <w:rPr>
-                <w:rFonts w:ascii="Verdana" w:hAnsi="Verdana" w:cs="Calibri"/>
-                <w:color w:val="000000" w:themeColor="text1"/>
-                <w:sz w:val="20"/>
-                <w:szCs w:val="20"/>
-              </w:rPr>
-              <w:t>5</w:t>
-            </w:r>
-          </w:p>
-        </w:tc>
-        <w:tc>
-          <w:tcPr>
-            <w:tcW w:w="1231" w:type="pct"/>
-            <w:tcBorders>
-              <w:top w:val="single" w:sz="4" w:space="0" w:color="auto"/>
-              <w:left w:val="nil"/>
-              <w:bottom w:val="single" w:sz="4" w:space="0" w:color="auto"/>
-              <w:right w:val="single" w:sz="4" w:space="0" w:color="auto"/>
-            </w:tcBorders>
-            <w:vAlign w:val="center"/>
-          </w:tcPr>
-          <w:p>
-            <w:pPr>
-              <w:rPr>
-                <w:rFonts w:ascii="Verdana" w:hAnsi="Verdana" w:cs="Calibri"/>
-                <w:color w:val="000000"/>
-                <w:sz w:val="20"/>
-                <w:szCs w:val="20"/>
-              </w:rPr>
-            </w:pPr>
-            <w:r>
-              <w:rPr>
-                <w:rFonts w:ascii="Verdana" w:hAnsi="Verdana" w:cs="Calibri"/>
-                <w:color w:val="000000"/>
-                <w:sz w:val="20"/>
-                <w:szCs w:val="20"/>
-              </w:rPr>
-              <w:t>Docente</w:t>
-            </w:r>
-          </w:p>
-        </w:tc>
-        <w:tc>
-          <w:tcPr>
-            <w:tcW w:w="2231" w:type="pct"/>
-            <w:tcBorders>
-              <w:top w:val="single" w:sz="4" w:space="0" w:color="auto"/>
-              <w:left w:val="single" w:sz="4" w:space="0" w:color="auto"/>
-              <w:bottom w:val="single" w:sz="4" w:space="0" w:color="auto"/>
-              <w:right w:val="nil"/>
-            </w:tcBorders>
-            <w:vAlign w:val="center"/>
-          </w:tcPr>
-          <w:p>
-            <w:pPr>
-              <w:jc w:val="both"/>
-              <w:rPr>
-                <w:rFonts w:ascii="Verdana" w:hAnsi="Verdana" w:cs="Calibri"/>
-                <w:color w:val="000000"/>
-                <w:sz w:val="20"/>
-                <w:szCs w:val="20"/>
-                <w:lang w:val="pt-PT"/>
-              </w:rPr>
-            </w:pPr>
-            <w:r>
-              <w:rPr>
-                <w:rFonts w:ascii="Verdana" w:hAnsi="Verdana" w:cs="Calibri"/>
-                <w:color w:val="000000"/>
-                <w:sz w:val="20"/>
-                <w:szCs w:val="20"/>
-              </w:rPr>
-              <w:t>Lic. Verónica Chávez Zambrano, Mg.</w:t>
-            </w:r>
-          </w:p>
-        </w:tc>
-        <w:tc>
-          <w:tcPr>
-            <w:tcW w:w="1230" w:type="pct"/>
-            <w:tcBorders>
-              <w:top w:val="single" w:sz="4" w:space="0" w:color="auto"/>
-              <w:left w:val="single" w:sz="4" w:space="0" w:color="auto"/>
-              <w:bottom w:val="single" w:sz="4" w:space="0" w:color="auto"/>
-              <w:right w:val="single" w:sz="4" w:space="0" w:color="auto"/>
-            </w:tcBorders>
-            <w:vAlign w:val="center"/>
-          </w:tcPr>
-          <w:p>
-            <w:pPr>
-              <w:rPr>
-                <w:rFonts w:ascii="Verdana" w:hAnsi="Verdana" w:cs="Calibri"/>
-                <w:color w:val="000000" w:themeColor="text1"/>
-                <w:sz w:val="20"/>
-                <w:szCs w:val="20"/>
-                <w:lang w:val="pt-PT"/>
-              </w:rPr>
-            </w:pPr>
-          </w:p>
-        </w:tc>
-      </w:tr>
-      <w:tr>
-        <w:trPr>
-          <w:trHeight w:val="680"/>
-        </w:trPr>
-        <w:tc>
-          <w:tcPr>
-            <w:tcW w:w="308" w:type="pct"/>
-            <w:tcBorders>
-              <w:top w:val="single" w:sz="4" w:space="0" w:color="auto"/>
-              <w:left w:val="single" w:sz="4" w:space="0" w:color="auto"/>
-              <w:bottom w:val="single" w:sz="4" w:space="0" w:color="auto"/>
-              <w:right w:val="single" w:sz="4" w:space="0" w:color="auto"/>
-            </w:tcBorders>
-            <w:vAlign w:val="center"/>
-            <w:hideMark/>
-          </w:tcPr>
-          <w:p>
-            <w:pPr>
-              <w:jc w:val="center"/>
-              <w:rPr>
-                <w:rFonts w:ascii="Verdana" w:hAnsi="Verdana" w:cs="Calibri"/>
-                <w:color w:val="000000" w:themeColor="text1"/>
-                <w:sz w:val="20"/>
-                <w:szCs w:val="20"/>
-              </w:rPr>
-            </w:pPr>
-            <w:r>
-              <w:rPr>
-                <w:rFonts w:ascii="Verdana" w:hAnsi="Verdana" w:cs="Calibri"/>
-                <w:color w:val="000000" w:themeColor="text1"/>
-                <w:sz w:val="20"/>
-                <w:szCs w:val="20"/>
-              </w:rPr>
-              <w:t>6</w:t>
-            </w:r>
-          </w:p>
-        </w:tc>
-        <w:tc>
-          <w:tcPr>
-            <w:tcW w:w="1231" w:type="pct"/>
-            <w:tcBorders>
-              <w:top w:val="single" w:sz="4" w:space="0" w:color="auto"/>
-              <w:left w:val="nil"/>
-              <w:bottom w:val="single" w:sz="4" w:space="0" w:color="auto"/>
-              <w:right w:val="single" w:sz="4" w:space="0" w:color="auto"/>
-            </w:tcBorders>
-            <w:vAlign w:val="center"/>
-          </w:tcPr>
-          <w:p>
-            <w:pPr>
-              <w:rPr>
-                <w:rFonts w:ascii="Verdana" w:hAnsi="Verdana" w:cstheme="minorHAnsi"/>
-                <w:sz w:val="20"/>
-                <w:szCs w:val="20"/>
-              </w:rPr>
-            </w:pPr>
-            <w:r>
-              <w:rPr>
-                <w:rFonts w:ascii="Verdana" w:hAnsi="Verdana" w:cs="Calibri"/>
-                <w:color w:val="000000"/>
-                <w:sz w:val="20"/>
-                <w:szCs w:val="20"/>
-              </w:rPr>
-              <w:t>Docente</w:t>
-            </w:r>
-          </w:p>
-        </w:tc>
-        <w:tc>
-          <w:tcPr>
-            <w:tcW w:w="2231" w:type="pct"/>
-            <w:tcBorders>
-              <w:top w:val="single" w:sz="4" w:space="0" w:color="auto"/>
-              <w:left w:val="single" w:sz="4" w:space="0" w:color="auto"/>
-              <w:bottom w:val="single" w:sz="4" w:space="0" w:color="auto"/>
-              <w:right w:val="nil"/>
-            </w:tcBorders>
-            <w:vAlign w:val="center"/>
-          </w:tcPr>
-          <w:p>
-            <w:pPr>
-              <w:jc w:val="both"/>
-              <w:rPr>
-                <w:rFonts w:ascii="Verdana" w:hAnsi="Verdana" w:cs="Calibri"/>
-                <w:color w:val="000000"/>
-                <w:sz w:val="20"/>
-                <w:szCs w:val="20"/>
-              </w:rPr>
-            </w:pPr>
-            <w:r>
-              <w:rPr>
-                <w:rFonts w:ascii="Verdana" w:hAnsi="Verdana" w:cs="Calibri"/>
-                <w:color w:val="000000"/>
-                <w:sz w:val="20"/>
-                <w:szCs w:val="20"/>
-              </w:rPr>
-              <w:t>Lic. Gonzalo Farfán Corrales, Mg.</w:t>
-            </w:r>
-          </w:p>
-        </w:tc>
-        <w:tc>
-          <w:tcPr>
-            <w:tcW w:w="1230" w:type="pct"/>
-            <w:tcBorders>
-              <w:top w:val="single" w:sz="4" w:space="0" w:color="auto"/>
-              <w:left w:val="single" w:sz="4" w:space="0" w:color="auto"/>
-              <w:bottom w:val="single" w:sz="4" w:space="0" w:color="auto"/>
-              <w:right w:val="single" w:sz="4" w:space="0" w:color="auto"/>
-            </w:tcBorders>
-            <w:vAlign w:val="center"/>
-          </w:tcPr>
-          <w:p>
-            <w:pPr>
-              <w:rPr>
-                <w:rFonts w:ascii="Verdana" w:hAnsi="Verdana" w:cs="Calibri"/>
-                <w:color w:val="000000" w:themeColor="text1"/>
-                <w:sz w:val="20"/>
-                <w:szCs w:val="20"/>
-                <w:lang w:val="es-EC"/>
-              </w:rPr>
-            </w:pPr>
-          </w:p>
-        </w:tc>
-      </w:tr>
-      <w:tr>
-        <w:trPr>
-          <w:trHeight w:val="680"/>
-        </w:trPr>
-        <w:tc>
-          <w:tcPr>
-            <w:tcW w:w="308" w:type="pct"/>
-            <w:tcBorders>
-              <w:top w:val="single" w:sz="4" w:space="0" w:color="auto"/>
-              <w:left w:val="single" w:sz="4" w:space="0" w:color="auto"/>
-              <w:bottom w:val="single" w:sz="4" w:space="0" w:color="auto"/>
-              <w:right w:val="single" w:sz="4" w:space="0" w:color="auto"/>
-            </w:tcBorders>
-            <w:vAlign w:val="center"/>
-            <w:hideMark/>
-          </w:tcPr>
-          <w:p>
-            <w:pPr>
-              <w:jc w:val="center"/>
-              <w:rPr>
-                <w:rFonts w:ascii="Verdana" w:hAnsi="Verdana" w:cs="Calibri"/>
-                <w:color w:val="000000" w:themeColor="text1"/>
-                <w:sz w:val="20"/>
-                <w:szCs w:val="20"/>
-              </w:rPr>
-            </w:pPr>
-            <w:r>
-              <w:rPr>
-                <w:rFonts w:ascii="Verdana" w:hAnsi="Verdana" w:cs="Calibri"/>
-                <w:color w:val="000000" w:themeColor="text1"/>
-                <w:sz w:val="20"/>
-                <w:szCs w:val="20"/>
-              </w:rPr>
-              <w:t>7</w:t>
-            </w:r>
-          </w:p>
-        </w:tc>
-        <w:tc>
-          <w:tcPr>
-            <w:tcW w:w="1231" w:type="pct"/>
-            <w:tcBorders>
-              <w:top w:val="single" w:sz="4" w:space="0" w:color="auto"/>
-              <w:left w:val="nil"/>
-              <w:bottom w:val="single" w:sz="4" w:space="0" w:color="auto"/>
-              <w:right w:val="single" w:sz="4" w:space="0" w:color="auto"/>
-            </w:tcBorders>
-            <w:vAlign w:val="center"/>
-          </w:tcPr>
-          <w:p>
-            <w:pPr>
-              <w:rPr>
-                <w:rFonts w:ascii="Verdana" w:hAnsi="Verdana" w:cstheme="minorHAnsi"/>
-                <w:sz w:val="20"/>
-                <w:szCs w:val="20"/>
-              </w:rPr>
-            </w:pPr>
-            <w:r>
-              <w:rPr>
-                <w:rFonts w:ascii="Verdana" w:hAnsi="Verdana" w:cs="Calibri"/>
-                <w:color w:val="000000"/>
-                <w:sz w:val="20"/>
-                <w:szCs w:val="20"/>
-              </w:rPr>
-              <w:t>Docente</w:t>
-            </w:r>
-          </w:p>
-        </w:tc>
-        <w:tc>
-          <w:tcPr>
-            <w:tcW w:w="2231" w:type="pct"/>
-            <w:tcBorders>
-              <w:top w:val="single" w:sz="4" w:space="0" w:color="auto"/>
-              <w:left w:val="single" w:sz="4" w:space="0" w:color="auto"/>
-              <w:bottom w:val="single" w:sz="4" w:space="0" w:color="auto"/>
-              <w:right w:val="nil"/>
-            </w:tcBorders>
-            <w:vAlign w:val="center"/>
-          </w:tcPr>
-          <w:p>
-            <w:pPr>
-              <w:rPr>
-                <w:rFonts w:ascii="Verdana" w:hAnsi="Verdana" w:cs="Calibri"/>
-                <w:color w:val="000000"/>
-                <w:sz w:val="20"/>
-                <w:szCs w:val="20"/>
-                <w:lang w:val="pt-BR"/>
-              </w:rPr>
-            </w:pPr>
-            <w:r>
-              <w:rPr>
-                <w:rFonts w:ascii="Verdana" w:hAnsi="Verdana" w:cs="Calibri"/>
-                <w:color w:val="000000"/>
-                <w:sz w:val="20"/>
-                <w:szCs w:val="20"/>
-                <w:lang w:val="pt-BR"/>
-              </w:rPr>
-              <w:t>Lic. Laura Mena Sánchez, Mg.</w:t>
-            </w:r>
-          </w:p>
-        </w:tc>
-        <w:tc>
-          <w:tcPr>
-            <w:tcW w:w="1230" w:type="pct"/>
-            <w:tcBorders>
-              <w:top w:val="single" w:sz="4" w:space="0" w:color="auto"/>
-              <w:left w:val="single" w:sz="4" w:space="0" w:color="auto"/>
-              <w:bottom w:val="single" w:sz="4" w:space="0" w:color="auto"/>
-              <w:right w:val="single" w:sz="4" w:space="0" w:color="auto"/>
-            </w:tcBorders>
-            <w:vAlign w:val="center"/>
-          </w:tcPr>
-          <w:p>
-            <w:pPr>
-              <w:rPr>
-                <w:rFonts w:ascii="Verdana" w:hAnsi="Verdana" w:cs="Calibri"/>
-                <w:color w:val="000000" w:themeColor="text1"/>
-                <w:sz w:val="20"/>
-                <w:szCs w:val="20"/>
-                <w:lang w:val="pt-BR"/>
-              </w:rPr>
-            </w:pPr>
-          </w:p>
-        </w:tc>
-      </w:tr>
-      <w:tr>
-        <w:trPr>
-          <w:trHeight w:val="680"/>
-        </w:trPr>
-        <w:tc>
-          <w:tcPr>
-            <w:tcW w:w="308" w:type="pct"/>
-            <w:tcBorders>
-              <w:top w:val="single" w:sz="4" w:space="0" w:color="auto"/>
-              <w:left w:val="single" w:sz="4" w:space="0" w:color="auto"/>
-              <w:bottom w:val="single" w:sz="4" w:space="0" w:color="auto"/>
-              <w:right w:val="single" w:sz="4" w:space="0" w:color="auto"/>
-            </w:tcBorders>
-            <w:vAlign w:val="center"/>
-            <w:hideMark/>
-          </w:tcPr>
-          <w:p>
-            <w:pPr>
-              <w:jc w:val="center"/>
-              <w:rPr>
-                <w:rFonts w:ascii="Verdana" w:hAnsi="Verdana" w:cs="Calibri"/>
-                <w:color w:val="000000" w:themeColor="text1"/>
-                <w:sz w:val="20"/>
-                <w:szCs w:val="20"/>
-              </w:rPr>
-            </w:pPr>
-            <w:r>
-              <w:rPr>
-                <w:rFonts w:ascii="Verdana" w:hAnsi="Verdana" w:cs="Calibri"/>
-                <w:color w:val="000000" w:themeColor="text1"/>
-                <w:sz w:val="20"/>
-                <w:szCs w:val="20"/>
-              </w:rPr>
-              <w:t>8</w:t>
-            </w:r>
-          </w:p>
-        </w:tc>
-        <w:tc>
-          <w:tcPr>
-            <w:tcW w:w="1231" w:type="pct"/>
-            <w:tcBorders>
-              <w:top w:val="single" w:sz="4" w:space="0" w:color="auto"/>
-              <w:left w:val="nil"/>
-              <w:bottom w:val="single" w:sz="4" w:space="0" w:color="auto"/>
-              <w:right w:val="single" w:sz="4" w:space="0" w:color="auto"/>
-            </w:tcBorders>
-            <w:vAlign w:val="center"/>
-          </w:tcPr>
-          <w:p>
-            <w:pPr>
-              <w:rPr>
-                <w:rFonts w:ascii="Verdana" w:hAnsi="Verdana" w:cstheme="minorHAnsi"/>
-                <w:sz w:val="20"/>
-                <w:szCs w:val="20"/>
-              </w:rPr>
-            </w:pPr>
-            <w:r>
-              <w:rPr>
-                <w:rFonts w:ascii="Verdana" w:hAnsi="Verdana" w:cs="Calibri"/>
-                <w:color w:val="000000"/>
-                <w:sz w:val="20"/>
-                <w:szCs w:val="20"/>
-              </w:rPr>
-              <w:t>Docente</w:t>
-            </w:r>
-          </w:p>
-        </w:tc>
-        <w:tc>
-          <w:tcPr>
-            <w:tcW w:w="2231" w:type="pct"/>
-            <w:tcBorders>
-              <w:top w:val="single" w:sz="4" w:space="0" w:color="auto"/>
-              <w:left w:val="single" w:sz="4" w:space="0" w:color="auto"/>
-              <w:bottom w:val="single" w:sz="4" w:space="0" w:color="auto"/>
-              <w:right w:val="nil"/>
-            </w:tcBorders>
-            <w:vAlign w:val="center"/>
-          </w:tcPr>
-          <w:p>
-            <w:pPr>
-              <w:jc w:val="both"/>
-              <w:rPr>
-                <w:rFonts w:ascii="Verdana" w:hAnsi="Verdana" w:cs="Calibri"/>
-                <w:color w:val="000000"/>
-                <w:sz w:val="20"/>
-                <w:szCs w:val="20"/>
-                <w:lang w:val="pt-BR"/>
-              </w:rPr>
-            </w:pPr>
-            <w:r>
-              <w:rPr>
-                <w:rFonts w:ascii="Verdana" w:hAnsi="Verdana" w:cs="Calibri"/>
-                <w:color w:val="000000"/>
-                <w:sz w:val="20"/>
-                <w:szCs w:val="20"/>
-              </w:rPr>
-              <w:t>Dr. Arturo Rodríguez Zambrano, PhD.</w:t>
-            </w:r>
-          </w:p>
-        </w:tc>
-        <w:tc>
-          <w:tcPr>
-            <w:tcW w:w="1230" w:type="pct"/>
-            <w:tcBorders>
-              <w:top w:val="single" w:sz="4" w:space="0" w:color="auto"/>
-              <w:left w:val="single" w:sz="4" w:space="0" w:color="auto"/>
-              <w:bottom w:val="single" w:sz="4" w:space="0" w:color="auto"/>
-              <w:right w:val="single" w:sz="4" w:space="0" w:color="auto"/>
-            </w:tcBorders>
-            <w:vAlign w:val="center"/>
-          </w:tcPr>
-          <w:p>
-            <w:pPr>
-              <w:rPr>
-                <w:rFonts w:ascii="Verdana" w:hAnsi="Verdana" w:cs="Calibri"/>
-                <w:color w:val="000000" w:themeColor="text1"/>
-                <w:sz w:val="20"/>
-                <w:szCs w:val="20"/>
-                <w:lang w:val="pt-BR"/>
-              </w:rPr>
-            </w:pPr>
-          </w:p>
-        </w:tc>
-      </w:tr>
-      <w:tr>
-        <w:trPr>
-          <w:trHeight w:val="680"/>
-        </w:trPr>
-        <w:tc>
-          <w:tcPr>
-            <w:tcW w:w="308" w:type="pct"/>
-            <w:tcBorders>
-              <w:top w:val="single" w:sz="4" w:space="0" w:color="auto"/>
-              <w:left w:val="single" w:sz="4" w:space="0" w:color="auto"/>
-              <w:bottom w:val="single" w:sz="4" w:space="0" w:color="auto"/>
-              <w:right w:val="single" w:sz="4" w:space="0" w:color="auto"/>
-            </w:tcBorders>
-            <w:vAlign w:val="center"/>
-            <w:hideMark/>
-          </w:tcPr>
-          <w:p>
-            <w:pPr>
-              <w:jc w:val="center"/>
-              <w:rPr>
-                <w:rFonts w:ascii="Verdana" w:hAnsi="Verdana" w:cs="Calibri"/>
-                <w:color w:val="000000" w:themeColor="text1"/>
-                <w:sz w:val="20"/>
-                <w:szCs w:val="20"/>
-              </w:rPr>
-            </w:pPr>
-            <w:r>
-              <w:rPr>
-                <w:rFonts w:ascii="Verdana" w:hAnsi="Verdana" w:cs="Calibri"/>
-                <w:color w:val="000000" w:themeColor="text1"/>
-                <w:sz w:val="20"/>
-                <w:szCs w:val="20"/>
-              </w:rPr>
-              <w:t>9</w:t>
-            </w:r>
-          </w:p>
-        </w:tc>
-        <w:tc>
-          <w:tcPr>
-            <w:tcW w:w="1231" w:type="pct"/>
-            <w:tcBorders>
-              <w:top w:val="single" w:sz="4" w:space="0" w:color="auto"/>
-              <w:left w:val="nil"/>
-              <w:bottom w:val="single" w:sz="4" w:space="0" w:color="auto"/>
-              <w:right w:val="single" w:sz="4" w:space="0" w:color="auto"/>
-            </w:tcBorders>
-            <w:vAlign w:val="center"/>
-          </w:tcPr>
-          <w:p>
-            <w:pPr>
-              <w:rPr>
-                <w:rFonts w:ascii="Verdana" w:hAnsi="Verdana" w:cstheme="minorHAnsi"/>
-                <w:sz w:val="20"/>
-                <w:szCs w:val="20"/>
-                <w:lang w:val="pt-PT"/>
-              </w:rPr>
-            </w:pPr>
-            <w:r>
-              <w:rPr>
-                <w:rFonts w:ascii="Verdana" w:hAnsi="Verdana" w:cs="Calibri"/>
-                <w:color w:val="000000"/>
-                <w:sz w:val="20"/>
-                <w:szCs w:val="20"/>
-              </w:rPr>
-              <w:t>Docente</w:t>
-            </w:r>
-          </w:p>
-        </w:tc>
-        <w:tc>
-          <w:tcPr>
-            <w:tcW w:w="2231" w:type="pct"/>
-            <w:tcBorders>
-              <w:top w:val="single" w:sz="4" w:space="0" w:color="auto"/>
-              <w:left w:val="single" w:sz="4" w:space="0" w:color="auto"/>
-              <w:bottom w:val="single" w:sz="4" w:space="0" w:color="auto"/>
-              <w:right w:val="nil"/>
-            </w:tcBorders>
-            <w:vAlign w:val="center"/>
-          </w:tcPr>
-          <w:p>
-            <w:pPr>
-              <w:jc w:val="both"/>
-              <w:rPr>
-                <w:rFonts w:ascii="Verdana" w:hAnsi="Verdana" w:cs="Calibri"/>
-                <w:color w:val="000000"/>
-                <w:sz w:val="20"/>
-                <w:szCs w:val="20"/>
-              </w:rPr>
-            </w:pPr>
-            <w:r>
-              <w:rPr>
-                <w:rFonts w:ascii="Verdana" w:hAnsi="Verdana" w:cs="Calibri"/>
-                <w:color w:val="000000"/>
-                <w:sz w:val="20"/>
-                <w:szCs w:val="20"/>
-              </w:rPr>
-              <w:t>Dr. Jhonny Villafuerte Holguín, PhD.</w:t>
-            </w:r>
-          </w:p>
-        </w:tc>
-        <w:tc>
-          <w:tcPr>
-            <w:tcW w:w="1230" w:type="pct"/>
-            <w:tcBorders>
-              <w:top w:val="single" w:sz="4" w:space="0" w:color="auto"/>
-              <w:left w:val="single" w:sz="4" w:space="0" w:color="auto"/>
-              <w:bottom w:val="single" w:sz="4" w:space="0" w:color="auto"/>
-              <w:right w:val="single" w:sz="4" w:space="0" w:color="auto"/>
-            </w:tcBorders>
-            <w:vAlign w:val="center"/>
-          </w:tcPr>
-          <w:p>
-            <w:pPr>
-              <w:rPr>
-                <w:rFonts w:ascii="Verdana" w:hAnsi="Verdana" w:cs="Calibri"/>
-                <w:color w:val="000000" w:themeColor="text1"/>
-                <w:sz w:val="20"/>
-                <w:szCs w:val="20"/>
-                <w:lang w:val="es-EC"/>
-              </w:rPr>
-            </w:pPr>
-          </w:p>
-        </w:tc>
-      </w:tr>
-      <w:tr>
-        <w:trPr>
-          <w:trHeight w:val="680"/>
-        </w:trPr>
-        <w:tc>
-          <w:tcPr>
-            <w:tcW w:w="308" w:type="pct"/>
-            <w:tcBorders>
-              <w:top w:val="single" w:sz="4" w:space="0" w:color="auto"/>
-              <w:left w:val="single" w:sz="4" w:space="0" w:color="auto"/>
-              <w:bottom w:val="single" w:sz="4" w:space="0" w:color="auto"/>
-              <w:right w:val="single" w:sz="4" w:space="0" w:color="auto"/>
-            </w:tcBorders>
-            <w:vAlign w:val="center"/>
-            <w:hideMark/>
-          </w:tcPr>
-          <w:p>
-            <w:pPr>
-              <w:jc w:val="center"/>
-              <w:rPr>
-                <w:rFonts w:ascii="Verdana" w:hAnsi="Verdana" w:cs="Calibri"/>
-                <w:color w:val="000000" w:themeColor="text1"/>
-                <w:sz w:val="20"/>
-                <w:szCs w:val="20"/>
-              </w:rPr>
-            </w:pPr>
-            <w:r>
-              <w:rPr>
-                <w:rFonts w:ascii="Verdana" w:hAnsi="Verdana" w:cs="Calibri"/>
-                <w:color w:val="000000" w:themeColor="text1"/>
-                <w:sz w:val="20"/>
-                <w:szCs w:val="20"/>
-              </w:rPr>
-              <w:t>10</w:t>
-            </w:r>
-          </w:p>
-        </w:tc>
-        <w:tc>
-          <w:tcPr>
-            <w:tcW w:w="1231" w:type="pct"/>
-            <w:tcBorders>
-              <w:top w:val="single" w:sz="4" w:space="0" w:color="auto"/>
-              <w:left w:val="nil"/>
-              <w:bottom w:val="single" w:sz="4" w:space="0" w:color="auto"/>
-              <w:right w:val="single" w:sz="4" w:space="0" w:color="auto"/>
-            </w:tcBorders>
-            <w:vAlign w:val="center"/>
-          </w:tcPr>
-          <w:p>
-            <w:pPr>
-              <w:rPr>
-                <w:rFonts w:ascii="Verdana" w:hAnsi="Verdana" w:cstheme="minorHAnsi"/>
-                <w:sz w:val="20"/>
-                <w:szCs w:val="20"/>
-              </w:rPr>
-            </w:pPr>
-            <w:r>
-              <w:rPr>
-                <w:rFonts w:ascii="Verdana" w:hAnsi="Verdana" w:cs="Calibri"/>
-                <w:color w:val="000000"/>
-                <w:sz w:val="20"/>
-                <w:szCs w:val="20"/>
-              </w:rPr>
-              <w:t>Docente</w:t>
-            </w:r>
-          </w:p>
-        </w:tc>
-        <w:tc>
-          <w:tcPr>
-            <w:tcW w:w="2231" w:type="pct"/>
-            <w:tcBorders>
-              <w:top w:val="single" w:sz="4" w:space="0" w:color="auto"/>
-              <w:left w:val="single" w:sz="4" w:space="0" w:color="auto"/>
-              <w:bottom w:val="single" w:sz="4" w:space="0" w:color="auto"/>
-              <w:right w:val="nil"/>
-            </w:tcBorders>
-            <w:vAlign w:val="center"/>
-          </w:tcPr>
-          <w:p>
-            <w:pPr>
-              <w:rPr>
-                <w:rFonts w:ascii="Verdana" w:hAnsi="Verdana" w:cs="Calibri"/>
-                <w:color w:val="000000"/>
-                <w:sz w:val="20"/>
-                <w:szCs w:val="20"/>
-                <w:lang w:val="pt-BR"/>
-              </w:rPr>
-            </w:pPr>
-            <w:r>
-              <w:rPr>
-                <w:rFonts w:ascii="Verdana" w:hAnsi="Verdana" w:cs="Calibri"/>
-                <w:color w:val="000000"/>
-                <w:sz w:val="20"/>
-                <w:szCs w:val="20"/>
-                <w:lang w:val="pt-PT"/>
-              </w:rPr>
-              <w:t>Lic. Cintya Zambrano Zambrano, Mg.</w:t>
-            </w:r>
-          </w:p>
-        </w:tc>
-        <w:tc>
-          <w:tcPr>
-            <w:tcW w:w="1230" w:type="pct"/>
-            <w:tcBorders>
-              <w:top w:val="single" w:sz="4" w:space="0" w:color="auto"/>
-              <w:left w:val="single" w:sz="4" w:space="0" w:color="auto"/>
-              <w:bottom w:val="single" w:sz="4" w:space="0" w:color="auto"/>
-              <w:right w:val="single" w:sz="4" w:space="0" w:color="auto"/>
-            </w:tcBorders>
-            <w:vAlign w:val="center"/>
-          </w:tcPr>
-          <w:p>
-            <w:pPr>
-              <w:rPr>
-                <w:rFonts w:ascii="Verdana" w:hAnsi="Verdana" w:cs="Calibri"/>
-                <w:color w:val="000000" w:themeColor="text1"/>
-                <w:sz w:val="20"/>
-                <w:szCs w:val="20"/>
-                <w:lang w:val="pt-BR"/>
               </w:rPr>
             </w:pPr>
           </w:p>

</xml_diff>